<commit_message>
Lab 2 update order and lab configs
</commit_message>
<xml_diff>
--- a/lab_2/questions_32_2.docx
+++ b/lab_2/questions_32_2.docx
@@ -106,18 +106,19 @@
     </w:p>
     <w:p>
       <w:pPr>
-        <w:rPr>
-          <w:lang w:val="fr-CA"/>
-        </w:rPr>
-      </w:pPr>
-    </w:p>
-    <w:p>
-      <w:pPr>
         <w:pStyle w:val="Subtitle"/>
         <w:rPr>
           <w:lang w:val="fr-CA"/>
         </w:rPr>
       </w:pPr>
+    </w:p>
+    <w:p>
+      <w:pPr>
+        <w:pStyle w:val="Subtitle"/>
+        <w:rPr>
+          <w:lang w:val="fr-CA"/>
+        </w:rPr>
+      </w:pPr>
       <w:r>
         <w:rPr>
           <w:lang w:val="fr-CA"/>
@@ -129,6 +130,133 @@
           <w:lang w:val="fr-CA"/>
         </w:rPr>
         <w:t>1</w:t>
+      </w:r>
+    </w:p>
+    <w:p>
+      <w:pPr>
+        <w:rPr>
+          <w:lang w:val="fr-CA"/>
+        </w:rPr>
+      </w:pPr>
+      <w:r>
+        <w:rPr>
+          <w:lang w:val="fr-CA"/>
+        </w:rPr>
+        <w:t xml:space="preserve">Avec une capture d’image dans l’oscilloscope, capture la ligne </w:t>
+      </w:r>
+      <w:proofErr w:type="spellStart"/>
+      <w:r>
+        <w:rPr>
+          <w:lang w:val="fr-CA"/>
+        </w:rPr>
+        <w:t>Rx</w:t>
+      </w:r>
+      <w:proofErr w:type="spellEnd"/>
+      <w:r>
+        <w:rPr>
+          <w:lang w:val="fr-CA"/>
+        </w:rPr>
+        <w:t xml:space="preserve"> et </w:t>
+      </w:r>
+      <w:proofErr w:type="spellStart"/>
+      <w:r>
+        <w:rPr>
+          <w:lang w:val="fr-CA"/>
+        </w:rPr>
+        <w:t>Tx</w:t>
+      </w:r>
+      <w:proofErr w:type="spellEnd"/>
+      <w:r>
+        <w:rPr>
+          <w:lang w:val="fr-CA"/>
+        </w:rPr>
+        <w:t xml:space="preserve"> de la ligne UART qui envoie le caractère ‘A’</w:t>
+      </w:r>
+    </w:p>
+    <w:p>
+      <w:pPr>
+        <w:rPr>
+          <w:lang w:val="fr-CA"/>
+        </w:rPr>
+      </w:pPr>
+      <w:r>
+        <w:rPr>
+          <w:lang w:val="fr-CA"/>
+        </w:rPr>
+        <w:t>.</w:t>
+      </w:r>
+    </w:p>
+    <w:p>
+      <w:pPr>
+        <w:rPr>
+          <w:lang w:val="fr-CA"/>
+        </w:rPr>
+      </w:pPr>
+      <w:r>
+        <w:rPr>
+          <w:lang w:val="fr-CA"/>
+        </w:rPr>
+        <w:t>.</w:t>
+      </w:r>
+    </w:p>
+    <w:p>
+      <w:pPr>
+        <w:rPr>
+          <w:lang w:val="fr-CA"/>
+        </w:rPr>
+      </w:pPr>
+      <w:r>
+        <w:rPr>
+          <w:lang w:val="fr-CA"/>
+        </w:rPr>
+        <w:t>.</w:t>
+      </w:r>
+    </w:p>
+    <w:p>
+      <w:pPr>
+        <w:rPr>
+          <w:lang w:val="fr-CA"/>
+        </w:rPr>
+      </w:pPr>
+      <w:r>
+        <w:rPr>
+          <w:lang w:val="fr-CA"/>
+        </w:rPr>
+        <w:t>.</w:t>
+      </w:r>
+    </w:p>
+    <w:p>
+      <w:pPr>
+        <w:rPr>
+          <w:lang w:val="fr-CA"/>
+        </w:rPr>
+      </w:pPr>
+    </w:p>
+    <w:p>
+      <w:pPr>
+        <w:rPr>
+          <w:lang w:val="fr-CA"/>
+        </w:rPr>
+      </w:pPr>
+    </w:p>
+    <w:p>
+      <w:pPr>
+        <w:pStyle w:val="Subtitle"/>
+        <w:rPr>
+          <w:lang w:val="fr-CA"/>
+        </w:rPr>
+      </w:pPr>
+      <w:r>
+        <w:rPr>
+          <w:lang w:val="fr-CA"/>
+        </w:rPr>
+        <w:t xml:space="preserve">Partie </w:t>
+      </w:r>
+      <w:r>
+        <w:rPr>
+          <w:lang w:val="fr-CA"/>
+        </w:rPr>
+        <w:t>2</w:t>
       </w:r>
     </w:p>
     <w:p>

</xml_diff>